<commit_message>
new garden note + projects and skills update
</commit_message>
<xml_diff>
--- a/assets/HrishikaResume.docx
+++ b/assets/HrishikaResume.docx
@@ -753,27 +753,37 @@
                 <w:b/>
                 <w:bCs/>
               </w:rPr>
-              <w:t xml:space="preserve"> Neuroscience</w:t>
-            </w:r>
-            <w:r>
-              <w:rPr>
-                <w:rFonts w:cstheme="minorHAnsi"/>
-              </w:rPr>
-              <w:t>,</w:t>
-            </w:r>
-            <w:r>
-              <w:rPr>
-                <w:rFonts w:cstheme="minorHAnsi"/>
-                <w:sz w:val="44"/>
-                <w:szCs w:val="44"/>
-              </w:rPr>
               <w:t xml:space="preserve"> </w:t>
             </w:r>
-            <w:r>
-              <w:rPr>
-                <w:rFonts w:cstheme="minorHAnsi"/>
-              </w:rPr>
-              <w:t xml:space="preserve">Minor in </w:t>
+            <w:proofErr w:type="gramStart"/>
+            <w:r>
+              <w:rPr>
+                <w:rFonts w:cstheme="minorHAnsi"/>
+                <w:b/>
+                <w:bCs/>
+              </w:rPr>
+              <w:t>Neuroscience</w:t>
+            </w:r>
+            <w:r>
+              <w:rPr>
+                <w:rFonts w:cstheme="minorHAnsi"/>
+                <w:b/>
+                <w:bCs/>
+              </w:rPr>
+              <w:t xml:space="preserve">,  </w:t>
+            </w:r>
+            <w:r>
+              <w:rPr>
+                <w:rFonts w:cstheme="minorHAnsi"/>
+              </w:rPr>
+              <w:t>Minor</w:t>
+            </w:r>
+            <w:proofErr w:type="gramEnd"/>
+            <w:r>
+              <w:rPr>
+                <w:rFonts w:cstheme="minorHAnsi"/>
+              </w:rPr>
+              <w:t xml:space="preserve"> in </w:t>
             </w:r>
             <w:r>
               <w:rPr>

</xml_diff>